<commit_message>
ex 1 part 2
</commit_message>
<xml_diff>
--- a/PA1_CastellaCot_MartinGiol_GutierrezCanuto/bin/p07_BarrageLaunchers/ShortReport.docx
+++ b/PA1_CastellaCot_MartinGiol_GutierrezCanuto/bin/p07_BarrageLaunchers/ShortReport.docx
@@ -121,7 +121,7 @@
               <w:rPr>
                 <w:color w:val="FF0000"/>
               </w:rPr>
-              <w:t>Answer here</w:t>
+              <w:t>I used a fixed thread pool with as many threads as available processors. This balances performance and avoids creating too many threads.</w:t>
             </w:r>
           </w:p>
         </w:tc>
@@ -160,7 +160,13 @@
               <w:rPr>
                 <w:color w:val="FF0000"/>
               </w:rPr>
-              <w:t>Answer here</w:t>
+              <w:t>I considered a cached thread pool but rejected it because it could create too many threads, increasing overhead instead of improving speed</w:t>
+            </w:r>
+            <w:r>
+              <w:rPr>
+                <w:color w:val="FF0000"/>
+              </w:rPr>
+              <w:t>.</w:t>
             </w:r>
           </w:p>
         </w:tc>
@@ -230,6 +236,17 @@
             <w:r>
               <w:t>Execution time</w:t>
             </w:r>
+            <w:r>
+              <w:t xml:space="preserve"> (</w:t>
+            </w:r>
+            <w:proofErr w:type="spellStart"/>
+            <w:r>
+              <w:t>ms</w:t>
+            </w:r>
+            <w:proofErr w:type="spellEnd"/>
+            <w:r>
+              <w:t>)</w:t>
+            </w:r>
           </w:p>
         </w:tc>
       </w:tr>
@@ -305,13 +322,21 @@
           <w:tcPr>
             <w:tcW w:w="2831" w:type="dxa"/>
           </w:tcPr>
-          <w:p/>
+          <w:p>
+            <w:r>
+              <w:t>1330</w:t>
+            </w:r>
+          </w:p>
         </w:tc>
         <w:tc>
           <w:tcPr>
             <w:tcW w:w="2832" w:type="dxa"/>
           </w:tcPr>
-          <w:p/>
+          <w:p>
+            <w:r>
+              <w:t>12907</w:t>
+            </w:r>
+          </w:p>
         </w:tc>
       </w:tr>
       <w:tr>
@@ -337,13 +362,21 @@
           <w:tcPr>
             <w:tcW w:w="2831" w:type="dxa"/>
           </w:tcPr>
-          <w:p/>
+          <w:p>
+            <w:r>
+              <w:t>1429</w:t>
+            </w:r>
+          </w:p>
         </w:tc>
         <w:tc>
           <w:tcPr>
             <w:tcW w:w="2832" w:type="dxa"/>
           </w:tcPr>
-          <w:p/>
+          <w:p>
+            <w:r>
+              <w:t>12942</w:t>
+            </w:r>
+          </w:p>
         </w:tc>
       </w:tr>
       <w:tr>
@@ -369,13 +402,21 @@
           <w:tcPr>
             <w:tcW w:w="2831" w:type="dxa"/>
           </w:tcPr>
-          <w:p/>
+          <w:p>
+            <w:r>
+              <w:t>1272</w:t>
+            </w:r>
+          </w:p>
         </w:tc>
         <w:tc>
           <w:tcPr>
             <w:tcW w:w="2832" w:type="dxa"/>
           </w:tcPr>
-          <w:p/>
+          <w:p>
+            <w:r>
+              <w:t>12306</w:t>
+            </w:r>
+          </w:p>
         </w:tc>
       </w:tr>
       <w:tr>
@@ -401,13 +442,21 @@
           <w:tcPr>
             <w:tcW w:w="2831" w:type="dxa"/>
           </w:tcPr>
-          <w:p/>
+          <w:p>
+            <w:r>
+              <w:t>1559</w:t>
+            </w:r>
+          </w:p>
         </w:tc>
         <w:tc>
           <w:tcPr>
             <w:tcW w:w="2832" w:type="dxa"/>
           </w:tcPr>
-          <w:p/>
+          <w:p>
+            <w:r>
+              <w:t>12535</w:t>
+            </w:r>
+          </w:p>
         </w:tc>
       </w:tr>
       <w:tr>
@@ -433,13 +482,21 @@
           <w:tcPr>
             <w:tcW w:w="2831" w:type="dxa"/>
           </w:tcPr>
-          <w:p/>
+          <w:p>
+            <w:r>
+              <w:t>1705</w:t>
+            </w:r>
+          </w:p>
         </w:tc>
         <w:tc>
           <w:tcPr>
             <w:tcW w:w="2832" w:type="dxa"/>
           </w:tcPr>
-          <w:p/>
+          <w:p>
+            <w:r>
+              <w:t>12213</w:t>
+            </w:r>
+          </w:p>
         </w:tc>
       </w:tr>
       <w:tr>
@@ -465,13 +522,21 @@
           <w:tcPr>
             <w:tcW w:w="2831" w:type="dxa"/>
           </w:tcPr>
-          <w:p/>
+          <w:p>
+            <w:r>
+              <w:t>1805</w:t>
+            </w:r>
+          </w:p>
         </w:tc>
         <w:tc>
           <w:tcPr>
             <w:tcW w:w="2832" w:type="dxa"/>
           </w:tcPr>
-          <w:p/>
+          <w:p>
+            <w:r>
+              <w:t>12292</w:t>
+            </w:r>
+          </w:p>
         </w:tc>
       </w:tr>
       <w:tr>
@@ -497,13 +562,21 @@
           <w:tcPr>
             <w:tcW w:w="2831" w:type="dxa"/>
           </w:tcPr>
-          <w:p/>
+          <w:p>
+            <w:r>
+              <w:t>1731</w:t>
+            </w:r>
+          </w:p>
         </w:tc>
         <w:tc>
           <w:tcPr>
             <w:tcW w:w="2832" w:type="dxa"/>
           </w:tcPr>
-          <w:p/>
+          <w:p>
+            <w:r>
+              <w:t>12642</w:t>
+            </w:r>
+          </w:p>
         </w:tc>
       </w:tr>
       <w:tr>
@@ -529,13 +602,21 @@
           <w:tcPr>
             <w:tcW w:w="2831" w:type="dxa"/>
           </w:tcPr>
-          <w:p/>
+          <w:p>
+            <w:r>
+              <w:t>1836</w:t>
+            </w:r>
+          </w:p>
         </w:tc>
         <w:tc>
           <w:tcPr>
             <w:tcW w:w="2832" w:type="dxa"/>
           </w:tcPr>
-          <w:p/>
+          <w:p>
+            <w:r>
+              <w:t>12321</w:t>
+            </w:r>
+          </w:p>
         </w:tc>
       </w:tr>
       <w:tr>
@@ -561,13 +642,21 @@
           <w:tcPr>
             <w:tcW w:w="2831" w:type="dxa"/>
           </w:tcPr>
-          <w:p/>
+          <w:p>
+            <w:r>
+              <w:t>1803</w:t>
+            </w:r>
+          </w:p>
         </w:tc>
         <w:tc>
           <w:tcPr>
             <w:tcW w:w="2832" w:type="dxa"/>
           </w:tcPr>
-          <w:p/>
+          <w:p>
+            <w:r>
+              <w:t>12201</w:t>
+            </w:r>
+          </w:p>
         </w:tc>
       </w:tr>
       <w:tr>
@@ -593,13 +682,21 @@
           <w:tcPr>
             <w:tcW w:w="2831" w:type="dxa"/>
           </w:tcPr>
-          <w:p/>
+          <w:p>
+            <w:r>
+              <w:t>1637</w:t>
+            </w:r>
+          </w:p>
         </w:tc>
         <w:tc>
           <w:tcPr>
             <w:tcW w:w="2832" w:type="dxa"/>
           </w:tcPr>
-          <w:p/>
+          <w:p>
+            <w:r>
+              <w:t>12602</w:t>
+            </w:r>
+          </w:p>
         </w:tc>
       </w:tr>
       <w:tr>
@@ -620,13 +717,21 @@
           <w:tcPr>
             <w:tcW w:w="2831" w:type="dxa"/>
           </w:tcPr>
-          <w:p/>
+          <w:p>
+            <w:r>
+              <w:t>1600,7</w:t>
+            </w:r>
+          </w:p>
         </w:tc>
         <w:tc>
           <w:tcPr>
             <w:tcW w:w="2832" w:type="dxa"/>
           </w:tcPr>
-          <w:p/>
+          <w:p>
+            <w:r>
+              <w:t>12446,1</w:t>
+            </w:r>
+          </w:p>
         </w:tc>
       </w:tr>
     </w:tbl>
@@ -670,7 +775,7 @@
               <w:rPr>
                 <w:color w:val="FF0000"/>
               </w:rPr>
-              <w:t>Answer here</w:t>
+              <w:t>The non-pooled strategy caused more interference because creating 100,000 separate threads overloaded the system. The pooled approach reused threads, making it much faster.</w:t>
             </w:r>
           </w:p>
         </w:tc>
@@ -1388,7 +1493,6 @@
   <w:style w:type="character" w:default="1" w:styleId="Fuentedeprrafopredeter">
     <w:name w:val="Default Paragraph Font"/>
     <w:uiPriority w:val="1"/>
-    <w:semiHidden/>
     <w:unhideWhenUsed/>
   </w:style>
   <w:style w:type="table" w:default="1" w:styleId="Tablanormal">

</xml_diff>